<commit_message>
checkpoint: full working tree snapshot April 14 before rollback
</commit_message>
<xml_diff>
--- a/templates/DealDesk_Report_Template_v4.docx
+++ b/templates/DealDesk_Report_Template_v4.docx
@@ -1306,7 +1306,7 @@
                 <w:sz w:val="20"/>
                 <w:szCs w:val="20"/>
               </w:rPr>
-              <w:t xml:space="preserve">{{ photo_gallery_hero }}</w:t>
+              <w:t>{{ photo_gallery_hero }}</w:t>
             </w:r>
           </w:p>
           <w:p>
@@ -1347,7 +1347,6 @@
           <w:sz w:val="18"/>
           <w:szCs w:val="18"/>
         </w:rPr>
-        <w:t xml:space="preserve">Figure 2.1 — Exterior Hero Shot  |  Source: </w:t>
       </w:r>
       <w:r>
         <w:rPr>
@@ -1357,7 +1356,6 @@
           <w:szCs w:val="22"/>
           <w:highlight w:val="yellow"/>
         </w:rPr>
-        <w:t xml:space="preserve">{{ photo_hero_source }}</w:t>
       </w:r>
     </w:p>
     <w:p>
@@ -1418,7 +1416,7 @@
                 <w:sz w:val="20"/>
                 <w:szCs w:val="20"/>
               </w:rPr>
-              <w:t xml:space="preserve">{{ photo_gallery_grid }}</w:t>
+              <w:t>{{ photo_gallery_grid }}</w:t>
             </w:r>
           </w:p>
           <w:p>
@@ -1459,7 +1457,6 @@
           <w:sz w:val="18"/>
           <w:szCs w:val="18"/>
         </w:rPr>
-        <w:t xml:space="preserve">Figure 2.2 — Property Photo Gallery  |  Sources as captioned  |  AI-extracted via Prompt 1A</w:t>
       </w:r>
     </w:p>
     <w:p>
@@ -1587,7 +1584,7 @@
                 <w:sz w:val="20"/>
                 <w:szCs w:val="20"/>
               </w:rPr>
-              <w:t xml:space="preserve">{{ floor_plan_block }}</w:t>
+              <w:t>{{ floor_plan_block }}</w:t>
             </w:r>
           </w:p>
           <w:p>
@@ -1628,7 +1625,6 @@
           <w:sz w:val="18"/>
           <w:szCs w:val="18"/>
         </w:rPr>
-        <w:t xml:space="preserve">Figure 2.3 — Floor Plans  |  Source: AI image classification (Prompt 1A)  |  DealDesk, </w:t>
       </w:r>
       <w:r>
         <w:rPr>
@@ -1638,7 +1634,6 @@
           <w:szCs w:val="22"/>
           <w:highlight w:val="yellow"/>
         </w:rPr>
-        <w:t xml:space="preserve">{{ report_date }}</w:t>
       </w:r>
     </w:p>
     <w:p>
@@ -1852,7 +1847,6 @@
           <w:sz w:val="18"/>
           <w:szCs w:val="18"/>
         </w:rPr>
-        <w:t xml:space="preserve">Figure 3.1 — Aerial Map  |  © OpenStreetMap contributors  |  Coordinates: </w:t>
       </w:r>
       <w:r>
         <w:rPr>
@@ -1862,7 +1856,6 @@
           <w:szCs w:val="22"/>
           <w:highlight w:val="yellow"/>
         </w:rPr>
-        <w:t xml:space="preserve">{{ coordinates }}</w:t>
       </w:r>
     </w:p>
     <w:p>
@@ -1986,7 +1979,6 @@
           <w:sz w:val="18"/>
           <w:szCs w:val="18"/>
         </w:rPr>
-        <w:t xml:space="preserve">Figure 3.2 — Neighborhood Context Map  |  Source: Google Maps Static API / OpenStreetMap</w:t>
       </w:r>
     </w:p>
     <w:p>
@@ -2126,7 +2118,6 @@
           <w:sz w:val="18"/>
           <w:szCs w:val="18"/>
         </w:rPr>
-        <w:t xml:space="preserve">Figure 3.3 — FEMA Flood Map  |  Source: FEMA NFHL (msc.fema.gov)  |  Panel: </w:t>
       </w:r>
       <w:r>
         <w:rPr>
@@ -2136,7 +2127,6 @@
           <w:szCs w:val="22"/>
           <w:highlight w:val="yellow"/>
         </w:rPr>
-        <w:t xml:space="preserve">{{ fema_panel_number }}</w:t>
       </w:r>
     </w:p>
     <w:p>
@@ -5458,7 +5448,6 @@
           <w:sz w:val="18"/>
           <w:szCs w:val="18"/>
         </w:rPr>
-        <w:t xml:space="preserve">Figure 8.1 — Demographic Trends  |  Source: U.S. Census Bureau ACS 5-Year Estimates  |  data.census.gov</w:t>
       </w:r>
     </w:p>
     <w:p>
@@ -6022,7 +6011,7 @@
                 <w:sz w:val="20"/>
                 <w:szCs w:val="20"/>
               </w:rPr>
-              <w:t xml:space="preserve">{{ supply_pipeline_chart }}</w:t>
+              <w:t>{{ supply_pipeline_chart }}</w:t>
             </w:r>
           </w:p>
           <w:p>
@@ -6063,7 +6052,6 @@
           <w:sz w:val="18"/>
           <w:szCs w:val="18"/>
         </w:rPr>
-        <w:t xml:space="preserve">Figure 9.1 — Supply Pipeline  |  Sources: Philadelphia L&amp;I, CoStar, City Planning Commission</w:t>
       </w:r>
     </w:p>
     <w:p>
@@ -11895,7 +11883,6 @@
           <w:sz w:val="18"/>
           <w:szCs w:val="18"/>
         </w:rPr>
-        <w:t xml:space="preserve">Figure 12.1 — Pro Forma Charts  |  Source: DealDesk Underwriting Model</w:t>
       </w:r>
     </w:p>
     <w:p>
@@ -12040,7 +12027,6 @@
           <w:sz w:val="18"/>
           <w:szCs w:val="18"/>
         </w:rPr>
-        <w:t xml:space="preserve">Figure 12.2 — IRR Heatmap  |  Base case highlighted  |  Source: DealDesk Underwriting Model</w:t>
       </w:r>
     </w:p>
     <w:p>
@@ -12676,7 +12662,6 @@
           <w:sz w:val="18"/>
           <w:szCs w:val="18"/>
         </w:rPr>
-        <w:t xml:space="preserve">Figure 13.1 — Capital Stack  |  Source: DealDesk Underwriting Model</w:t>
       </w:r>
     </w:p>
     <w:p>
@@ -13250,7 +13235,6 @@
           <w:sz w:val="18"/>
           <w:szCs w:val="18"/>
         </w:rPr>
-        <w:t xml:space="preserve">Figure 13.2 — Financing Options  |  Rates as of </w:t>
       </w:r>
       <w:r>
         <w:rPr>
@@ -13260,7 +13244,6 @@
           <w:szCs w:val="22"/>
           <w:highlight w:val="yellow"/>
         </w:rPr>
-        <w:t xml:space="preserve">{{ report_date }}</w:t>
       </w:r>
     </w:p>
     <w:p>
@@ -15216,7 +15199,6 @@
           <w:sz w:val="18"/>
           <w:szCs w:val="18"/>
         </w:rPr>
-        <w:t xml:space="preserve">Figure 16.1 — Risk Matrix  |  Source: DealDesk qualitative risk assessment  |  </w:t>
       </w:r>
       <w:r>
         <w:rPr>
@@ -15226,7 +15208,6 @@
           <w:szCs w:val="22"/>
           <w:highlight w:val="yellow"/>
         </w:rPr>
-        <w:t xml:space="preserve">{{ report_date }}</w:t>
       </w:r>
     </w:p>
     <w:p>
@@ -23505,7 +23486,6 @@
           <w:sz w:val="18"/>
           <w:szCs w:val="18"/>
         </w:rPr>
-        <w:t xml:space="preserve">Figure 18.1 — Project Timeline  |  Source: DealDesk Underwriting Model</w:t>
       </w:r>
     </w:p>
     <w:p>

</xml_diff>